<commit_message>
Brand und Krupa als Ansprechpartner festgelegt
Michael Brand (fachlich/technisch) und Nicole Krupa (kaufmaennisch/organisatorisch)
sind die Ansprechpartner fuer CertoClav.

- Datenanforderung: eigener Abschnitt "Ihre Ansprechpartner fuer uns" direkt nach
  der Einleitung, mit Themenaufteilung; Zuordnungstabelle und Rueckfragen-Block
  entsprechend angepasst
- beteiligte-und-rollen.md, projektstatus.md, eingangsstatus.md nachgezogen
- entscheidungslog.md: Festlegung mit Begruendung ergaenzt
- offene Frage 4 beantwortet; neue Frage 39: bei zwei Ansprechpartnern ist offen,
  wer final freigibt - das Arbeitsmodell aus dem Deck sieht nur einen vor

Co-Authored-By: Claude Opus 5 <noreply@anthropic.com>
Claude-Session: https://claude.ai/code/session_01GFfZvJBCzXCmDgx3EnU1YB
</commit_message>
<xml_diff>
--- a/04_Kundendokumente/Datenanforderung_biotec.docx
+++ b/04_Kundendokumente/Datenanforderung_biotec.docx
@@ -33,6 +33,221 @@
       </w:pPr>
       <w:r>
         <w:t>Bitte stellen Sie die folgenden Unterlagen bereit. Eine Aufbereitung ist nicht nötig – Rohexporte und Beispieldateien genügen, auch wenn sie unvollständig oder unsauber sind. Lieber ein unfertiger Export als keiner: Wir sehen daraus, wie Ihre Daten wirklich aussehen.</w:t>
+      </w:r>
+    </w:p>
+    <w:p>
+      <w:pPr>
+        <w:spacing w:before="280" w:after="0"/>
+      </w:pPr>
+      <w:r>
+        <w:rPr>
+          <w:rFonts w:ascii="Calibri" w:hAnsi="Calibri"/>
+          <w:b/>
+          <w:color w:val="7F7F7F"/>
+          <w:sz w:val="15"/>
+        </w:rPr>
+        <w:t>KOORDINATION</w:t>
+      </w:r>
+    </w:p>
+    <w:p>
+      <w:pPr>
+        <w:spacing w:before="40" w:after="120"/>
+        <w:pBdr>
+          <w:bottom w:val="single" w:sz="8" w:space="2" w:color="1F4E79"/>
+        </w:pBdr>
+      </w:pPr>
+      <w:r>
+        <w:rPr>
+          <w:b/>
+          <w:color w:val="1F4E79"/>
+          <w:sz w:val="26"/>
+        </w:rPr>
+        <w:t>Ihre Ansprechpartner für uns</w:t>
+      </w:r>
+    </w:p>
+    <w:tbl>
+      <w:tblPr>
+        <w:tblStyle w:val="TableGrid"/>
+        <w:tblW w:type="auto" w:w="0"/>
+        <w:jc w:val="left"/>
+        <w:tblLook w:firstColumn="1" w:firstRow="1" w:lastColumn="0" w:lastRow="0" w:noHBand="0" w:noVBand="1" w:val="04A0"/>
+      </w:tblPr>
+      <w:tblGrid>
+        <w:gridCol w:w="3213"/>
+        <w:gridCol w:w="3213"/>
+        <w:gridCol w:w="3213"/>
+      </w:tblGrid>
+      <w:tr>
+        <w:tc>
+          <w:tcPr>
+            <w:tcW w:type="dxa" w:w="2268"/>
+            <w:shd w:val="clear" w:fill="1F4E79"/>
+          </w:tcPr>
+          <w:p>
+            <w:pPr>
+              <w:spacing w:after="0"/>
+            </w:pPr>
+            <w:r>
+              <w:rPr>
+                <w:b/>
+                <w:color w:val="FFFFFF"/>
+                <w:sz w:val="19"/>
+              </w:rPr>
+              <w:t>Name</w:t>
+            </w:r>
+          </w:p>
+        </w:tc>
+        <w:tc>
+          <w:tcPr>
+            <w:tcW w:type="dxa" w:w="3175"/>
+            <w:shd w:val="clear" w:fill="1F4E79"/>
+          </w:tcPr>
+          <w:p>
+            <w:pPr>
+              <w:spacing w:after="0"/>
+            </w:pPr>
+            <w:r>
+              <w:rPr>
+                <w:b/>
+                <w:color w:val="FFFFFF"/>
+                <w:sz w:val="19"/>
+              </w:rPr>
+              <w:t>Rolle</w:t>
+            </w:r>
+          </w:p>
+        </w:tc>
+        <w:tc>
+          <w:tcPr>
+            <w:tcW w:type="dxa" w:w="4195"/>
+            <w:shd w:val="clear" w:fill="1F4E79"/>
+          </w:tcPr>
+          <w:p>
+            <w:pPr>
+              <w:spacing w:after="0"/>
+            </w:pPr>
+            <w:r>
+              <w:rPr>
+                <w:b/>
+                <w:color w:val="FFFFFF"/>
+                <w:sz w:val="19"/>
+              </w:rPr>
+              <w:t>Zuständig für</w:t>
+            </w:r>
+          </w:p>
+        </w:tc>
+      </w:tr>
+      <w:tr>
+        <w:tc>
+          <w:tcPr>
+            <w:tcW w:type="dxa" w:w="2268"/>
+          </w:tcPr>
+          <w:p>
+            <w:pPr>
+              <w:spacing w:after="0"/>
+            </w:pPr>
+            <w:r>
+              <w:rPr>
+                <w:sz w:val="19"/>
+              </w:rPr>
+              <w:t>Michael Brand</w:t>
+            </w:r>
+          </w:p>
+        </w:tc>
+        <w:tc>
+          <w:tcPr>
+            <w:tcW w:type="dxa" w:w="3175"/>
+          </w:tcPr>
+          <w:p>
+            <w:pPr>
+              <w:spacing w:after="0"/>
+            </w:pPr>
+            <w:r>
+              <w:rPr>
+                <w:sz w:val="19"/>
+              </w:rPr>
+              <w:t>Projektleiter Hygieneinspektion, Begleiter ERP-Projekt</w:t>
+            </w:r>
+          </w:p>
+        </w:tc>
+        <w:tc>
+          <w:tcPr>
+            <w:tcW w:type="dxa" w:w="4195"/>
+          </w:tcPr>
+          <w:p>
+            <w:pPr>
+              <w:spacing w:after="0"/>
+            </w:pPr>
+            <w:r>
+              <w:rPr>
+                <w:sz w:val="19"/>
+              </w:rPr>
+              <w:t>Fachliche und technische Themen: Anlagen, Laborprozess, Gutachten, Verträge, Altsystem</w:t>
+            </w:r>
+          </w:p>
+        </w:tc>
+      </w:tr>
+      <w:tr>
+        <w:tc>
+          <w:tcPr>
+            <w:tcW w:type="dxa" w:w="2268"/>
+          </w:tcPr>
+          <w:p>
+            <w:pPr>
+              <w:spacing w:after="0"/>
+            </w:pPr>
+            <w:r>
+              <w:rPr>
+                <w:sz w:val="19"/>
+              </w:rPr>
+              <w:t>Nicole Krupa</w:t>
+            </w:r>
+          </w:p>
+        </w:tc>
+        <w:tc>
+          <w:tcPr>
+            <w:tcW w:type="dxa" w:w="3175"/>
+          </w:tcPr>
+          <w:p>
+            <w:pPr>
+              <w:spacing w:after="0"/>
+            </w:pPr>
+            <w:r>
+              <w:rPr>
+                <w:sz w:val="19"/>
+              </w:rPr>
+              <w:t>Rechnungen, Schulungen, Werbung</w:t>
+            </w:r>
+          </w:p>
+        </w:tc>
+        <w:tc>
+          <w:tcPr>
+            <w:tcW w:type="dxa" w:w="4195"/>
+          </w:tcPr>
+          <w:p>
+            <w:pPr>
+              <w:spacing w:after="0"/>
+            </w:pPr>
+            <w:r>
+              <w:rPr>
+                <w:sz w:val="19"/>
+              </w:rPr>
+              <w:t>Kaufmännische und organisatorische Themen: Kunden, Belege, Preise, Schulungen, Layout</w:t>
+            </w:r>
+          </w:p>
+        </w:tc>
+      </w:tr>
+    </w:tbl>
+    <w:p>
+      <w:pPr>
+        <w:spacing w:after="40"/>
+      </w:pPr>
+      <w:r>
+        <w:rPr>
+          <w:i/>
+          <w:color w:val="7F7F7F"/>
+          <w:sz w:val="18"/>
+        </w:rPr>
+        <w:t>Beide bündeln die Rückmeldungen auf Ihrer Seite und stimmen sich mit den übrigen Beteiligten ab. Wir wenden uns mit Rückfragen an sie, statt einzelne Personen direkt anzusprechen.</w:t>
       </w:r>
     </w:p>
     <w:p>
@@ -178,7 +393,7 @@
           <w:color w:val="7F7F7F"/>
           <w:sz w:val="15"/>
         </w:rPr>
-        <w:t>ZUORDNUNG NACH ROLLE</w:t>
+        <w:t>ZUORDNUNG IN DER TABELLE</w:t>
       </w:r>
     </w:p>
     <w:p>
@@ -207,7 +422,7 @@
           <w:color w:val="7F7F7F"/>
           <w:sz w:val="18"/>
         </w:rPr>
-        <w:t>Vorschlag auf Basis der im Discovery Call genannten Funktionen – bitte korrigieren, wenn intern anders verteilt.</w:t>
+        <w:t>In der Spalte „Wer“ steht, wer die Unterlage am schnellsten zur Hand hat – ein Vorschlag auf Basis der im Discovery Call genannten Funktionen. Die Koordination läuft über Herrn Brand und Frau Krupa; bitte intern gern anders verteilen, wenn es so besser passt.</w:t>
       </w:r>
     </w:p>
     <w:tbl>
@@ -310,7 +525,7 @@
               <w:rPr>
                 <w:sz w:val="19"/>
               </w:rPr>
-              <w:t>Michael Brand – Projektleiter Hygieneinspektion, Begleiter ERP-Projekt</w:t>
+              <w:t>Michael Brand – Ansprechpartner (fachlich/technisch)</w:t>
             </w:r>
           </w:p>
         </w:tc>
@@ -344,7 +559,7 @@
               <w:rPr>
                 <w:sz w:val="19"/>
               </w:rPr>
-              <w:t>M. Frank</w:t>
+              <w:t>N. Krupa</w:t>
             </w:r>
           </w:p>
         </w:tc>
@@ -360,7 +575,7 @@
               <w:rPr>
                 <w:sz w:val="19"/>
               </w:rPr>
-              <w:t>Melanie Frank – Laborkoordination, übergeordnete Prozesse</w:t>
+              <w:t>Nicole Krupa – Ansprechpartnerin (kaufmännisch/organisatorisch)</w:t>
             </w:r>
           </w:p>
         </w:tc>
@@ -376,7 +591,7 @@
               <w:rPr>
                 <w:sz w:val="19"/>
               </w:rPr>
-              <w:t>Labor, Analysemethoden, Prüfpläne, Eigenproduktion</w:t>
+              <w:t>Kunden, Belege, Preise, Schulungen, Layout</w:t>
             </w:r>
           </w:p>
         </w:tc>
@@ -394,7 +609,7 @@
               <w:rPr>
                 <w:sz w:val="19"/>
               </w:rPr>
-              <w:t>N. Krupa</w:t>
+              <w:t>M. Frank</w:t>
             </w:r>
           </w:p>
         </w:tc>
@@ -410,7 +625,7 @@
               <w:rPr>
                 <w:sz w:val="19"/>
               </w:rPr>
-              <w:t>Nicole Krupa – Rechnungen, Schulungen, Werbung</w:t>
+              <w:t>Melanie Frank – Laborkoordination, übergeordnete Prozesse</w:t>
             </w:r>
           </w:p>
         </w:tc>
@@ -426,7 +641,7 @@
               <w:rPr>
                 <w:sz w:val="19"/>
               </w:rPr>
-              <w:t>Kunden, Belege, Preise, Schulungen, Layout</w:t>
+              <w:t>Labor, Analysemethoden, Prüfpläne, Eigenproduktion</w:t>
             </w:r>
           </w:p>
         </w:tc>
@@ -8355,6 +8570,8 @@
           <w:sz w:val="20"/>
         </w:rPr>
         <w:t>Michael Simon  ·  michael.simon@certoclav.com  ·  CertoClav Consulting</w:t>
+        <w:br/>
+        <w:t>Auf Ihrer Seite: Michael Brand und Nicole Krupa</w:t>
       </w:r>
     </w:p>
     <w:sectPr>

</xml_diff>

<commit_message>
E-Mail-Adressen der Ansprechpartner in die Datenanforderung aufgenommen
Eigene Spalte in der Ansprechpartner-Tabelle und Nennung im Rueckfragen-Block
am Dokumentende.

Co-Authored-By: Claude Opus 5 <noreply@anthropic.com>
Claude-Session: https://claude.ai/code/session_01GFfZvJBCzXCmDgx3EnU1YB
</commit_message>
<xml_diff>
--- a/04_Kundendokumente/Datenanforderung_biotec.docx
+++ b/04_Kundendokumente/Datenanforderung_biotec.docx
@@ -73,13 +73,52 @@
         <w:tblLook w:firstColumn="1" w:firstRow="1" w:lastColumn="0" w:lastRow="0" w:noHBand="0" w:noVBand="1" w:val="04A0"/>
       </w:tblPr>
       <w:tblGrid>
-        <w:gridCol w:w="3213"/>
-        <w:gridCol w:w="3213"/>
-        <w:gridCol w:w="3213"/>
+        <w:gridCol w:w="2409"/>
+        <w:gridCol w:w="2409"/>
+        <w:gridCol w:w="2409"/>
+        <w:gridCol w:w="2409"/>
       </w:tblGrid>
       <w:tr>
         <w:tc>
           <w:tcPr>
+            <w:tcW w:type="dxa" w:w="1814"/>
+            <w:shd w:val="clear" w:fill="1F4E79"/>
+          </w:tcPr>
+          <w:p>
+            <w:pPr>
+              <w:spacing w:after="0"/>
+            </w:pPr>
+            <w:r>
+              <w:rPr>
+                <w:b/>
+                <w:color w:val="FFFFFF"/>
+                <w:sz w:val="19"/>
+              </w:rPr>
+              <w:t>Name</w:t>
+            </w:r>
+          </w:p>
+        </w:tc>
+        <w:tc>
+          <w:tcPr>
+            <w:tcW w:type="dxa" w:w="2721"/>
+            <w:shd w:val="clear" w:fill="1F4E79"/>
+          </w:tcPr>
+          <w:p>
+            <w:pPr>
+              <w:spacing w:after="0"/>
+            </w:pPr>
+            <w:r>
+              <w:rPr>
+                <w:b/>
+                <w:color w:val="FFFFFF"/>
+                <w:sz w:val="19"/>
+              </w:rPr>
+              <w:t>E-Mail</w:t>
+            </w:r>
+          </w:p>
+        </w:tc>
+        <w:tc>
+          <w:tcPr>
             <w:tcW w:type="dxa" w:w="2268"/>
             <w:shd w:val="clear" w:fill="1F4E79"/>
           </w:tcPr>
@@ -93,13 +132,13 @@
                 <w:color w:val="FFFFFF"/>
                 <w:sz w:val="19"/>
               </w:rPr>
-              <w:t>Name</w:t>
-            </w:r>
-          </w:p>
-        </w:tc>
-        <w:tc>
-          <w:tcPr>
-            <w:tcW w:type="dxa" w:w="3175"/>
+              <w:t>Rolle</w:t>
+            </w:r>
+          </w:p>
+        </w:tc>
+        <w:tc>
+          <w:tcPr>
+            <w:tcW w:type="dxa" w:w="2835"/>
             <w:shd w:val="clear" w:fill="1F4E79"/>
           </w:tcPr>
           <w:p>
@@ -112,25 +151,6 @@
                 <w:color w:val="FFFFFF"/>
                 <w:sz w:val="19"/>
               </w:rPr>
-              <w:t>Rolle</w:t>
-            </w:r>
-          </w:p>
-        </w:tc>
-        <w:tc>
-          <w:tcPr>
-            <w:tcW w:type="dxa" w:w="4195"/>
-            <w:shd w:val="clear" w:fill="1F4E79"/>
-          </w:tcPr>
-          <w:p>
-            <w:pPr>
-              <w:spacing w:after="0"/>
-            </w:pPr>
-            <w:r>
-              <w:rPr>
-                <w:b/>
-                <w:color w:val="FFFFFF"/>
-                <w:sz w:val="19"/>
-              </w:rPr>
               <w:t>Zuständig für</w:t>
             </w:r>
           </w:p>
@@ -139,6 +159,38 @@
       <w:tr>
         <w:tc>
           <w:tcPr>
+            <w:tcW w:type="dxa" w:w="1814"/>
+          </w:tcPr>
+          <w:p>
+            <w:pPr>
+              <w:spacing w:after="0"/>
+            </w:pPr>
+            <w:r>
+              <w:rPr>
+                <w:sz w:val="19"/>
+              </w:rPr>
+              <w:t>Michael Brand</w:t>
+            </w:r>
+          </w:p>
+        </w:tc>
+        <w:tc>
+          <w:tcPr>
+            <w:tcW w:type="dxa" w:w="2721"/>
+          </w:tcPr>
+          <w:p>
+            <w:pPr>
+              <w:spacing w:after="0"/>
+            </w:pPr>
+            <w:r>
+              <w:rPr>
+                <w:sz w:val="19"/>
+              </w:rPr>
+              <w:t>michael.brand@biotec-gmbh.com</w:t>
+            </w:r>
+          </w:p>
+        </w:tc>
+        <w:tc>
+          <w:tcPr>
             <w:tcW w:type="dxa" w:w="2268"/>
           </w:tcPr>
           <w:p>
@@ -149,29 +201,13 @@
               <w:rPr>
                 <w:sz w:val="19"/>
               </w:rPr>
-              <w:t>Michael Brand</w:t>
-            </w:r>
-          </w:p>
-        </w:tc>
-        <w:tc>
-          <w:tcPr>
-            <w:tcW w:type="dxa" w:w="3175"/>
-          </w:tcPr>
-          <w:p>
-            <w:pPr>
-              <w:spacing w:after="0"/>
-            </w:pPr>
-            <w:r>
-              <w:rPr>
-                <w:sz w:val="19"/>
-              </w:rPr>
               <w:t>Projektleiter Hygieneinspektion, Begleiter ERP-Projekt</w:t>
             </w:r>
           </w:p>
         </w:tc>
         <w:tc>
           <w:tcPr>
-            <w:tcW w:type="dxa" w:w="4195"/>
+            <w:tcW w:type="dxa" w:w="2835"/>
           </w:tcPr>
           <w:p>
             <w:pPr>
@@ -189,6 +225,38 @@
       <w:tr>
         <w:tc>
           <w:tcPr>
+            <w:tcW w:type="dxa" w:w="1814"/>
+          </w:tcPr>
+          <w:p>
+            <w:pPr>
+              <w:spacing w:after="0"/>
+            </w:pPr>
+            <w:r>
+              <w:rPr>
+                <w:sz w:val="19"/>
+              </w:rPr>
+              <w:t>Nicole Krupa</w:t>
+            </w:r>
+          </w:p>
+        </w:tc>
+        <w:tc>
+          <w:tcPr>
+            <w:tcW w:type="dxa" w:w="2721"/>
+          </w:tcPr>
+          <w:p>
+            <w:pPr>
+              <w:spacing w:after="0"/>
+            </w:pPr>
+            <w:r>
+              <w:rPr>
+                <w:sz w:val="19"/>
+              </w:rPr>
+              <w:t>nicole.krupa@biotec-gmbh.com</w:t>
+            </w:r>
+          </w:p>
+        </w:tc>
+        <w:tc>
+          <w:tcPr>
             <w:tcW w:type="dxa" w:w="2268"/>
           </w:tcPr>
           <w:p>
@@ -199,29 +267,13 @@
               <w:rPr>
                 <w:sz w:val="19"/>
               </w:rPr>
-              <w:t>Nicole Krupa</w:t>
-            </w:r>
-          </w:p>
-        </w:tc>
-        <w:tc>
-          <w:tcPr>
-            <w:tcW w:type="dxa" w:w="3175"/>
-          </w:tcPr>
-          <w:p>
-            <w:pPr>
-              <w:spacing w:after="0"/>
-            </w:pPr>
-            <w:r>
-              <w:rPr>
-                <w:sz w:val="19"/>
-              </w:rPr>
               <w:t>Rechnungen, Schulungen, Werbung</w:t>
             </w:r>
           </w:p>
         </w:tc>
         <w:tc>
           <w:tcPr>
-            <w:tcW w:type="dxa" w:w="4195"/>
+            <w:tcW w:type="dxa" w:w="2835"/>
           </w:tcPr>
           <w:p>
             <w:pPr>
@@ -8571,7 +8623,7 @@
         </w:rPr>
         <w:t>Michael Simon  ·  michael.simon@certoclav.com  ·  CertoClav Consulting</w:t>
         <w:br/>
-        <w:t>Auf Ihrer Seite: Michael Brand und Nicole Krupa</w:t>
+        <w:t>Auf Ihrer Seite: Michael Brand (michael.brand@biotec-gmbh.com) und Nicole Krupa (nicole.krupa@biotec-gmbh.com)</w:t>
       </w:r>
     </w:p>
     <w:sectPr>

</xml_diff>

<commit_message>
Paket-1-Zeilen in der Datenanforderung gelb hinterlegt
- docx_bausteine.table() nimmt jetzt optional zeilen_fuellung: eine Funktion,
  die je Zeile eine Hintergrundfarbe liefert
- datenanforderung.py hinterlegt die 20 Paket-1-Positionen in FFF2A8 und
  ergaenzt oben eine Legende in derselben Farbe

Gepruefte Ausgabe: 60 Positionen, 20 gelb, keine Abweichung zur Paket-Spalte.

Co-Authored-By: Claude Opus 5 <noreply@anthropic.com>
Claude-Session: https://claude.ai/code/session_01GFfZvJBCzXCmDgx3EnU1YB
</commit_message>
<xml_diff>
--- a/04_Kundendokumente/Datenanforderung_biotec.docx
+++ b/04_Kundendokumente/Datenanforderung_biotec.docx
@@ -338,7 +338,7 @@
         <w:ind w:left="397"/>
       </w:pPr>
       <w:r>
-        <w:t>– Paket 1 – wird für das Scoping und die Aufwandsschätzung gebraucht. Bitte zuerst, auch unvollständig.</w:t>
+        <w:t>– Paket 1 – in den Tabellen gelb hinterlegt. Das brauchen wir zuerst, für Scoping und Aufwandsschätzung. Auch unvollständig.</w:t>
       </w:r>
     </w:p>
     <w:p>
@@ -359,6 +359,57 @@
         <w:t>– Paket 3 – für den Feinschliff vor dem Go-live.</w:t>
       </w:r>
     </w:p>
+    <w:tbl>
+      <w:tblPr>
+        <w:tblStyle w:val="TableGrid"/>
+        <w:tblW w:type="auto" w:w="0"/>
+        <w:jc w:val="left"/>
+        <w:tblLook w:firstColumn="1" w:firstRow="1" w:lastColumn="0" w:lastRow="0" w:noHBand="0" w:noVBand="1" w:val="04A0"/>
+      </w:tblPr>
+      <w:tblGrid>
+        <w:gridCol w:w="9638"/>
+      </w:tblGrid>
+      <w:tr>
+        <w:tc>
+          <w:tcPr>
+            <w:tcW w:type="dxa" w:w="9638"/>
+            <w:shd w:val="clear" w:fill="1F4E79"/>
+          </w:tcPr>
+          <w:p>
+            <w:pPr>
+              <w:spacing w:after="0"/>
+            </w:pPr>
+            <w:r>
+              <w:rPr>
+                <w:b/>
+                <w:color w:val="FFFFFF"/>
+                <w:sz w:val="19"/>
+              </w:rPr>
+              <w:t>Legende</w:t>
+            </w:r>
+          </w:p>
+        </w:tc>
+      </w:tr>
+      <w:tr>
+        <w:tc>
+          <w:tcPr>
+            <w:tcW w:type="dxa" w:w="9638"/>
+            <w:shd w:val="clear" w:fill="FFF2A8"/>
+          </w:tcPr>
+          <w:p>
+            <w:pPr>
+              <w:spacing w:after="0"/>
+            </w:pPr>
+            <w:r>
+              <w:rPr>
+                <w:sz w:val="19"/>
+              </w:rPr>
+              <w:t>Gelb hinterlegte Zeilen = Paket 1. Diese Positionen brauchen wir zuerst.</w:t>
+            </w:r>
+          </w:p>
+        </w:tc>
+      </w:tr>
+    </w:tbl>
     <w:p>
       <w:pPr>
         <w:spacing w:before="280" w:after="0"/>
@@ -1005,6 +1056,7 @@
         <w:tc>
           <w:tcPr>
             <w:tcW w:type="dxa" w:w="567"/>
+            <w:shd w:val="clear" w:fill="FFF2A8"/>
           </w:tcPr>
           <w:p>
             <w:pPr>
@@ -1021,6 +1073,7 @@
         <w:tc>
           <w:tcPr>
             <w:tcW w:type="dxa" w:w="4195"/>
+            <w:shd w:val="clear" w:fill="FFF2A8"/>
           </w:tcPr>
           <w:p>
             <w:pPr>
@@ -1037,6 +1090,7 @@
         <w:tc>
           <w:tcPr>
             <w:tcW w:type="dxa" w:w="1701"/>
+            <w:shd w:val="clear" w:fill="FFF2A8"/>
           </w:tcPr>
           <w:p>
             <w:pPr>
@@ -1053,6 +1107,7 @@
         <w:tc>
           <w:tcPr>
             <w:tcW w:type="dxa" w:w="1247"/>
+            <w:shd w:val="clear" w:fill="FFF2A8"/>
           </w:tcPr>
           <w:p>
             <w:pPr>
@@ -1069,6 +1124,7 @@
         <w:tc>
           <w:tcPr>
             <w:tcW w:type="dxa" w:w="794"/>
+            <w:shd w:val="clear" w:fill="FFF2A8"/>
           </w:tcPr>
           <w:p>
             <w:pPr>
@@ -1085,6 +1141,7 @@
         <w:tc>
           <w:tcPr>
             <w:tcW w:type="dxa" w:w="1020"/>
+            <w:shd w:val="clear" w:fill="FFF2A8"/>
           </w:tcPr>
           <w:p>
             <w:pPr>
@@ -1201,6 +1258,7 @@
         <w:tc>
           <w:tcPr>
             <w:tcW w:type="dxa" w:w="567"/>
+            <w:shd w:val="clear" w:fill="FFF2A8"/>
           </w:tcPr>
           <w:p>
             <w:pPr>
@@ -1217,6 +1275,7 @@
         <w:tc>
           <w:tcPr>
             <w:tcW w:type="dxa" w:w="4195"/>
+            <w:shd w:val="clear" w:fill="FFF2A8"/>
           </w:tcPr>
           <w:p>
             <w:pPr>
@@ -1233,6 +1292,7 @@
         <w:tc>
           <w:tcPr>
             <w:tcW w:type="dxa" w:w="1701"/>
+            <w:shd w:val="clear" w:fill="FFF2A8"/>
           </w:tcPr>
           <w:p>
             <w:pPr>
@@ -1249,6 +1309,7 @@
         <w:tc>
           <w:tcPr>
             <w:tcW w:type="dxa" w:w="1247"/>
+            <w:shd w:val="clear" w:fill="FFF2A8"/>
           </w:tcPr>
           <w:p>
             <w:pPr>
@@ -1265,6 +1326,7 @@
         <w:tc>
           <w:tcPr>
             <w:tcW w:type="dxa" w:w="794"/>
+            <w:shd w:val="clear" w:fill="FFF2A8"/>
           </w:tcPr>
           <w:p>
             <w:pPr>
@@ -1281,6 +1343,7 @@
         <w:tc>
           <w:tcPr>
             <w:tcW w:type="dxa" w:w="1020"/>
+            <w:shd w:val="clear" w:fill="FFF2A8"/>
           </w:tcPr>
           <w:p>
             <w:pPr>
@@ -1460,6 +1523,7 @@
         <w:tc>
           <w:tcPr>
             <w:tcW w:type="dxa" w:w="567"/>
+            <w:shd w:val="clear" w:fill="FFF2A8"/>
           </w:tcPr>
           <w:p>
             <w:pPr>
@@ -1476,6 +1540,7 @@
         <w:tc>
           <w:tcPr>
             <w:tcW w:type="dxa" w:w="4195"/>
+            <w:shd w:val="clear" w:fill="FFF2A8"/>
           </w:tcPr>
           <w:p>
             <w:pPr>
@@ -1492,6 +1557,7 @@
         <w:tc>
           <w:tcPr>
             <w:tcW w:type="dxa" w:w="1701"/>
+            <w:shd w:val="clear" w:fill="FFF2A8"/>
           </w:tcPr>
           <w:p>
             <w:pPr>
@@ -1508,6 +1574,7 @@
         <w:tc>
           <w:tcPr>
             <w:tcW w:type="dxa" w:w="1247"/>
+            <w:shd w:val="clear" w:fill="FFF2A8"/>
           </w:tcPr>
           <w:p>
             <w:pPr>
@@ -1524,6 +1591,7 @@
         <w:tc>
           <w:tcPr>
             <w:tcW w:type="dxa" w:w="794"/>
+            <w:shd w:val="clear" w:fill="FFF2A8"/>
           </w:tcPr>
           <w:p>
             <w:pPr>
@@ -1540,6 +1608,7 @@
         <w:tc>
           <w:tcPr>
             <w:tcW w:type="dxa" w:w="1020"/>
+            <w:shd w:val="clear" w:fill="FFF2A8"/>
           </w:tcPr>
           <w:p>
             <w:pPr>
@@ -1558,6 +1627,7 @@
         <w:tc>
           <w:tcPr>
             <w:tcW w:type="dxa" w:w="567"/>
+            <w:shd w:val="clear" w:fill="FFF2A8"/>
           </w:tcPr>
           <w:p>
             <w:pPr>
@@ -1574,6 +1644,7 @@
         <w:tc>
           <w:tcPr>
             <w:tcW w:type="dxa" w:w="4195"/>
+            <w:shd w:val="clear" w:fill="FFF2A8"/>
           </w:tcPr>
           <w:p>
             <w:pPr>
@@ -1590,6 +1661,7 @@
         <w:tc>
           <w:tcPr>
             <w:tcW w:type="dxa" w:w="1701"/>
+            <w:shd w:val="clear" w:fill="FFF2A8"/>
           </w:tcPr>
           <w:p>
             <w:pPr>
@@ -1606,6 +1678,7 @@
         <w:tc>
           <w:tcPr>
             <w:tcW w:type="dxa" w:w="1247"/>
+            <w:shd w:val="clear" w:fill="FFF2A8"/>
           </w:tcPr>
           <w:p>
             <w:pPr>
@@ -1622,6 +1695,7 @@
         <w:tc>
           <w:tcPr>
             <w:tcW w:type="dxa" w:w="794"/>
+            <w:shd w:val="clear" w:fill="FFF2A8"/>
           </w:tcPr>
           <w:p>
             <w:pPr>
@@ -1638,6 +1712,7 @@
         <w:tc>
           <w:tcPr>
             <w:tcW w:type="dxa" w:w="1020"/>
+            <w:shd w:val="clear" w:fill="FFF2A8"/>
           </w:tcPr>
           <w:p>
             <w:pPr>
@@ -2553,6 +2628,7 @@
         <w:tc>
           <w:tcPr>
             <w:tcW w:type="dxa" w:w="567"/>
+            <w:shd w:val="clear" w:fill="FFF2A8"/>
           </w:tcPr>
           <w:p>
             <w:pPr>
@@ -2569,6 +2645,7 @@
         <w:tc>
           <w:tcPr>
             <w:tcW w:type="dxa" w:w="4195"/>
+            <w:shd w:val="clear" w:fill="FFF2A8"/>
           </w:tcPr>
           <w:p>
             <w:pPr>
@@ -2585,6 +2662,7 @@
         <w:tc>
           <w:tcPr>
             <w:tcW w:type="dxa" w:w="1701"/>
+            <w:shd w:val="clear" w:fill="FFF2A8"/>
           </w:tcPr>
           <w:p>
             <w:pPr>
@@ -2601,6 +2679,7 @@
         <w:tc>
           <w:tcPr>
             <w:tcW w:type="dxa" w:w="1247"/>
+            <w:shd w:val="clear" w:fill="FFF2A8"/>
           </w:tcPr>
           <w:p>
             <w:pPr>
@@ -2617,6 +2696,7 @@
         <w:tc>
           <w:tcPr>
             <w:tcW w:type="dxa" w:w="794"/>
+            <w:shd w:val="clear" w:fill="FFF2A8"/>
           </w:tcPr>
           <w:p>
             <w:pPr>
@@ -2633,6 +2713,7 @@
         <w:tc>
           <w:tcPr>
             <w:tcW w:type="dxa" w:w="1020"/>
+            <w:shd w:val="clear" w:fill="FFF2A8"/>
           </w:tcPr>
           <w:p>
             <w:pPr>
@@ -2651,6 +2732,7 @@
         <w:tc>
           <w:tcPr>
             <w:tcW w:type="dxa" w:w="567"/>
+            <w:shd w:val="clear" w:fill="FFF2A8"/>
           </w:tcPr>
           <w:p>
             <w:pPr>
@@ -2667,6 +2749,7 @@
         <w:tc>
           <w:tcPr>
             <w:tcW w:type="dxa" w:w="4195"/>
+            <w:shd w:val="clear" w:fill="FFF2A8"/>
           </w:tcPr>
           <w:p>
             <w:pPr>
@@ -2683,6 +2766,7 @@
         <w:tc>
           <w:tcPr>
             <w:tcW w:type="dxa" w:w="1701"/>
+            <w:shd w:val="clear" w:fill="FFF2A8"/>
           </w:tcPr>
           <w:p>
             <w:pPr>
@@ -2699,6 +2783,7 @@
         <w:tc>
           <w:tcPr>
             <w:tcW w:type="dxa" w:w="1247"/>
+            <w:shd w:val="clear" w:fill="FFF2A8"/>
           </w:tcPr>
           <w:p>
             <w:pPr>
@@ -2715,6 +2800,7 @@
         <w:tc>
           <w:tcPr>
             <w:tcW w:type="dxa" w:w="794"/>
+            <w:shd w:val="clear" w:fill="FFF2A8"/>
           </w:tcPr>
           <w:p>
             <w:pPr>
@@ -2731,6 +2817,7 @@
         <w:tc>
           <w:tcPr>
             <w:tcW w:type="dxa" w:w="1020"/>
+            <w:shd w:val="clear" w:fill="FFF2A8"/>
           </w:tcPr>
           <w:p>
             <w:pPr>
@@ -2749,6 +2836,7 @@
         <w:tc>
           <w:tcPr>
             <w:tcW w:type="dxa" w:w="567"/>
+            <w:shd w:val="clear" w:fill="FFF2A8"/>
           </w:tcPr>
           <w:p>
             <w:pPr>
@@ -2765,6 +2853,7 @@
         <w:tc>
           <w:tcPr>
             <w:tcW w:type="dxa" w:w="4195"/>
+            <w:shd w:val="clear" w:fill="FFF2A8"/>
           </w:tcPr>
           <w:p>
             <w:pPr>
@@ -2781,6 +2870,7 @@
         <w:tc>
           <w:tcPr>
             <w:tcW w:type="dxa" w:w="1701"/>
+            <w:shd w:val="clear" w:fill="FFF2A8"/>
           </w:tcPr>
           <w:p>
             <w:pPr>
@@ -2797,6 +2887,7 @@
         <w:tc>
           <w:tcPr>
             <w:tcW w:type="dxa" w:w="1247"/>
+            <w:shd w:val="clear" w:fill="FFF2A8"/>
           </w:tcPr>
           <w:p>
             <w:pPr>
@@ -2813,6 +2904,7 @@
         <w:tc>
           <w:tcPr>
             <w:tcW w:type="dxa" w:w="794"/>
+            <w:shd w:val="clear" w:fill="FFF2A8"/>
           </w:tcPr>
           <w:p>
             <w:pPr>
@@ -2829,6 +2921,7 @@
         <w:tc>
           <w:tcPr>
             <w:tcW w:type="dxa" w:w="1020"/>
+            <w:shd w:val="clear" w:fill="FFF2A8"/>
           </w:tcPr>
           <w:p>
             <w:pPr>
@@ -2847,6 +2940,7 @@
         <w:tc>
           <w:tcPr>
             <w:tcW w:type="dxa" w:w="567"/>
+            <w:shd w:val="clear" w:fill="FFF2A8"/>
           </w:tcPr>
           <w:p>
             <w:pPr>
@@ -2863,6 +2957,7 @@
         <w:tc>
           <w:tcPr>
             <w:tcW w:type="dxa" w:w="4195"/>
+            <w:shd w:val="clear" w:fill="FFF2A8"/>
           </w:tcPr>
           <w:p>
             <w:pPr>
@@ -2879,6 +2974,7 @@
         <w:tc>
           <w:tcPr>
             <w:tcW w:type="dxa" w:w="1701"/>
+            <w:shd w:val="clear" w:fill="FFF2A8"/>
           </w:tcPr>
           <w:p>
             <w:pPr>
@@ -2895,6 +2991,7 @@
         <w:tc>
           <w:tcPr>
             <w:tcW w:type="dxa" w:w="1247"/>
+            <w:shd w:val="clear" w:fill="FFF2A8"/>
           </w:tcPr>
           <w:p>
             <w:pPr>
@@ -2911,6 +3008,7 @@
         <w:tc>
           <w:tcPr>
             <w:tcW w:type="dxa" w:w="794"/>
+            <w:shd w:val="clear" w:fill="FFF2A8"/>
           </w:tcPr>
           <w:p>
             <w:pPr>
@@ -2927,6 +3025,7 @@
         <w:tc>
           <w:tcPr>
             <w:tcW w:type="dxa" w:w="1020"/>
+            <w:shd w:val="clear" w:fill="FFF2A8"/>
           </w:tcPr>
           <w:p>
             <w:pPr>
@@ -3191,6 +3290,7 @@
         <w:tc>
           <w:tcPr>
             <w:tcW w:type="dxa" w:w="567"/>
+            <w:shd w:val="clear" w:fill="FFF2A8"/>
           </w:tcPr>
           <w:p>
             <w:pPr>
@@ -3207,6 +3307,7 @@
         <w:tc>
           <w:tcPr>
             <w:tcW w:type="dxa" w:w="4195"/>
+            <w:shd w:val="clear" w:fill="FFF2A8"/>
           </w:tcPr>
           <w:p>
             <w:pPr>
@@ -3223,6 +3324,7 @@
         <w:tc>
           <w:tcPr>
             <w:tcW w:type="dxa" w:w="1701"/>
+            <w:shd w:val="clear" w:fill="FFF2A8"/>
           </w:tcPr>
           <w:p>
             <w:pPr>
@@ -3239,6 +3341,7 @@
         <w:tc>
           <w:tcPr>
             <w:tcW w:type="dxa" w:w="1247"/>
+            <w:shd w:val="clear" w:fill="FFF2A8"/>
           </w:tcPr>
           <w:p>
             <w:pPr>
@@ -3255,6 +3358,7 @@
         <w:tc>
           <w:tcPr>
             <w:tcW w:type="dxa" w:w="794"/>
+            <w:shd w:val="clear" w:fill="FFF2A8"/>
           </w:tcPr>
           <w:p>
             <w:pPr>
@@ -3271,6 +3375,7 @@
         <w:tc>
           <w:tcPr>
             <w:tcW w:type="dxa" w:w="1020"/>
+            <w:shd w:val="clear" w:fill="FFF2A8"/>
           </w:tcPr>
           <w:p>
             <w:pPr>
@@ -3289,6 +3394,7 @@
         <w:tc>
           <w:tcPr>
             <w:tcW w:type="dxa" w:w="567"/>
+            <w:shd w:val="clear" w:fill="FFF2A8"/>
           </w:tcPr>
           <w:p>
             <w:pPr>
@@ -3305,6 +3411,7 @@
         <w:tc>
           <w:tcPr>
             <w:tcW w:type="dxa" w:w="4195"/>
+            <w:shd w:val="clear" w:fill="FFF2A8"/>
           </w:tcPr>
           <w:p>
             <w:pPr>
@@ -3321,6 +3428,7 @@
         <w:tc>
           <w:tcPr>
             <w:tcW w:type="dxa" w:w="1701"/>
+            <w:shd w:val="clear" w:fill="FFF2A8"/>
           </w:tcPr>
           <w:p>
             <w:pPr>
@@ -3337,6 +3445,7 @@
         <w:tc>
           <w:tcPr>
             <w:tcW w:type="dxa" w:w="1247"/>
+            <w:shd w:val="clear" w:fill="FFF2A8"/>
           </w:tcPr>
           <w:p>
             <w:pPr>
@@ -3353,6 +3462,7 @@
         <w:tc>
           <w:tcPr>
             <w:tcW w:type="dxa" w:w="794"/>
+            <w:shd w:val="clear" w:fill="FFF2A8"/>
           </w:tcPr>
           <w:p>
             <w:pPr>
@@ -3369,6 +3479,7 @@
         <w:tc>
           <w:tcPr>
             <w:tcW w:type="dxa" w:w="1020"/>
+            <w:shd w:val="clear" w:fill="FFF2A8"/>
           </w:tcPr>
           <w:p>
             <w:pPr>
@@ -3485,6 +3596,7 @@
         <w:tc>
           <w:tcPr>
             <w:tcW w:type="dxa" w:w="567"/>
+            <w:shd w:val="clear" w:fill="FFF2A8"/>
           </w:tcPr>
           <w:p>
             <w:pPr>
@@ -3501,6 +3613,7 @@
         <w:tc>
           <w:tcPr>
             <w:tcW w:type="dxa" w:w="4195"/>
+            <w:shd w:val="clear" w:fill="FFF2A8"/>
           </w:tcPr>
           <w:p>
             <w:pPr>
@@ -3517,6 +3630,7 @@
         <w:tc>
           <w:tcPr>
             <w:tcW w:type="dxa" w:w="1701"/>
+            <w:shd w:val="clear" w:fill="FFF2A8"/>
           </w:tcPr>
           <w:p>
             <w:pPr>
@@ -3533,6 +3647,7 @@
         <w:tc>
           <w:tcPr>
             <w:tcW w:type="dxa" w:w="1247"/>
+            <w:shd w:val="clear" w:fill="FFF2A8"/>
           </w:tcPr>
           <w:p>
             <w:pPr>
@@ -3549,6 +3664,7 @@
         <w:tc>
           <w:tcPr>
             <w:tcW w:type="dxa" w:w="794"/>
+            <w:shd w:val="clear" w:fill="FFF2A8"/>
           </w:tcPr>
           <w:p>
             <w:pPr>
@@ -3565,6 +3681,7 @@
         <w:tc>
           <w:tcPr>
             <w:tcW w:type="dxa" w:w="1020"/>
+            <w:shd w:val="clear" w:fill="FFF2A8"/>
           </w:tcPr>
           <w:p>
             <w:pPr>
@@ -3927,6 +4044,7 @@
         <w:tc>
           <w:tcPr>
             <w:tcW w:type="dxa" w:w="567"/>
+            <w:shd w:val="clear" w:fill="FFF2A8"/>
           </w:tcPr>
           <w:p>
             <w:pPr>
@@ -3943,6 +4061,7 @@
         <w:tc>
           <w:tcPr>
             <w:tcW w:type="dxa" w:w="4195"/>
+            <w:shd w:val="clear" w:fill="FFF2A8"/>
           </w:tcPr>
           <w:p>
             <w:pPr>
@@ -3959,6 +4078,7 @@
         <w:tc>
           <w:tcPr>
             <w:tcW w:type="dxa" w:w="1701"/>
+            <w:shd w:val="clear" w:fill="FFF2A8"/>
           </w:tcPr>
           <w:p>
             <w:pPr>
@@ -3975,6 +4095,7 @@
         <w:tc>
           <w:tcPr>
             <w:tcW w:type="dxa" w:w="1247"/>
+            <w:shd w:val="clear" w:fill="FFF2A8"/>
           </w:tcPr>
           <w:p>
             <w:pPr>
@@ -3991,6 +4112,7 @@
         <w:tc>
           <w:tcPr>
             <w:tcW w:type="dxa" w:w="794"/>
+            <w:shd w:val="clear" w:fill="FFF2A8"/>
           </w:tcPr>
           <w:p>
             <w:pPr>
@@ -4007,6 +4129,7 @@
         <w:tc>
           <w:tcPr>
             <w:tcW w:type="dxa" w:w="1020"/>
+            <w:shd w:val="clear" w:fill="FFF2A8"/>
           </w:tcPr>
           <w:p>
             <w:pPr>
@@ -4382,6 +4505,7 @@
         <w:tc>
           <w:tcPr>
             <w:tcW w:type="dxa" w:w="567"/>
+            <w:shd w:val="clear" w:fill="FFF2A8"/>
           </w:tcPr>
           <w:p>
             <w:pPr>
@@ -4398,6 +4522,7 @@
         <w:tc>
           <w:tcPr>
             <w:tcW w:type="dxa" w:w="4195"/>
+            <w:shd w:val="clear" w:fill="FFF2A8"/>
           </w:tcPr>
           <w:p>
             <w:pPr>
@@ -4414,6 +4539,7 @@
         <w:tc>
           <w:tcPr>
             <w:tcW w:type="dxa" w:w="1701"/>
+            <w:shd w:val="clear" w:fill="FFF2A8"/>
           </w:tcPr>
           <w:p>
             <w:pPr>
@@ -4430,6 +4556,7 @@
         <w:tc>
           <w:tcPr>
             <w:tcW w:type="dxa" w:w="1247"/>
+            <w:shd w:val="clear" w:fill="FFF2A8"/>
           </w:tcPr>
           <w:p>
             <w:pPr>
@@ -4446,6 +4573,7 @@
         <w:tc>
           <w:tcPr>
             <w:tcW w:type="dxa" w:w="794"/>
+            <w:shd w:val="clear" w:fill="FFF2A8"/>
           </w:tcPr>
           <w:p>
             <w:pPr>
@@ -4462,6 +4590,7 @@
         <w:tc>
           <w:tcPr>
             <w:tcW w:type="dxa" w:w="1020"/>
+            <w:shd w:val="clear" w:fill="FFF2A8"/>
           </w:tcPr>
           <w:p>
             <w:pPr>
@@ -5216,6 +5345,7 @@
         <w:tc>
           <w:tcPr>
             <w:tcW w:type="dxa" w:w="567"/>
+            <w:shd w:val="clear" w:fill="FFF2A8"/>
           </w:tcPr>
           <w:p>
             <w:pPr>
@@ -5232,6 +5362,7 @@
         <w:tc>
           <w:tcPr>
             <w:tcW w:type="dxa" w:w="4195"/>
+            <w:shd w:val="clear" w:fill="FFF2A8"/>
           </w:tcPr>
           <w:p>
             <w:pPr>
@@ -5248,6 +5379,7 @@
         <w:tc>
           <w:tcPr>
             <w:tcW w:type="dxa" w:w="1701"/>
+            <w:shd w:val="clear" w:fill="FFF2A8"/>
           </w:tcPr>
           <w:p>
             <w:pPr>
@@ -5264,6 +5396,7 @@
         <w:tc>
           <w:tcPr>
             <w:tcW w:type="dxa" w:w="1247"/>
+            <w:shd w:val="clear" w:fill="FFF2A8"/>
           </w:tcPr>
           <w:p>
             <w:pPr>
@@ -5280,6 +5413,7 @@
         <w:tc>
           <w:tcPr>
             <w:tcW w:type="dxa" w:w="794"/>
+            <w:shd w:val="clear" w:fill="FFF2A8"/>
           </w:tcPr>
           <w:p>
             <w:pPr>
@@ -5296,6 +5430,7 @@
         <w:tc>
           <w:tcPr>
             <w:tcW w:type="dxa" w:w="1020"/>
+            <w:shd w:val="clear" w:fill="FFF2A8"/>
           </w:tcPr>
           <w:p>
             <w:pPr>
@@ -6161,6 +6296,7 @@
         <w:tc>
           <w:tcPr>
             <w:tcW w:type="dxa" w:w="567"/>
+            <w:shd w:val="clear" w:fill="FFF2A8"/>
           </w:tcPr>
           <w:p>
             <w:pPr>
@@ -6177,6 +6313,7 @@
         <w:tc>
           <w:tcPr>
             <w:tcW w:type="dxa" w:w="4195"/>
+            <w:shd w:val="clear" w:fill="FFF2A8"/>
           </w:tcPr>
           <w:p>
             <w:pPr>
@@ -6193,6 +6330,7 @@
         <w:tc>
           <w:tcPr>
             <w:tcW w:type="dxa" w:w="1701"/>
+            <w:shd w:val="clear" w:fill="FFF2A8"/>
           </w:tcPr>
           <w:p>
             <w:pPr>
@@ -6209,6 +6347,7 @@
         <w:tc>
           <w:tcPr>
             <w:tcW w:type="dxa" w:w="1247"/>
+            <w:shd w:val="clear" w:fill="FFF2A8"/>
           </w:tcPr>
           <w:p>
             <w:pPr>
@@ -6225,6 +6364,7 @@
         <w:tc>
           <w:tcPr>
             <w:tcW w:type="dxa" w:w="794"/>
+            <w:shd w:val="clear" w:fill="FFF2A8"/>
           </w:tcPr>
           <w:p>
             <w:pPr>
@@ -6241,6 +6381,7 @@
         <w:tc>
           <w:tcPr>
             <w:tcW w:type="dxa" w:w="1020"/>
+            <w:shd w:val="clear" w:fill="FFF2A8"/>
           </w:tcPr>
           <w:p>
             <w:pPr>
@@ -6259,6 +6400,7 @@
         <w:tc>
           <w:tcPr>
             <w:tcW w:type="dxa" w:w="567"/>
+            <w:shd w:val="clear" w:fill="FFF2A8"/>
           </w:tcPr>
           <w:p>
             <w:pPr>
@@ -6275,6 +6417,7 @@
         <w:tc>
           <w:tcPr>
             <w:tcW w:type="dxa" w:w="4195"/>
+            <w:shd w:val="clear" w:fill="FFF2A8"/>
           </w:tcPr>
           <w:p>
             <w:pPr>
@@ -6291,6 +6434,7 @@
         <w:tc>
           <w:tcPr>
             <w:tcW w:type="dxa" w:w="1701"/>
+            <w:shd w:val="clear" w:fill="FFF2A8"/>
           </w:tcPr>
           <w:p>
             <w:pPr>
@@ -6307,6 +6451,7 @@
         <w:tc>
           <w:tcPr>
             <w:tcW w:type="dxa" w:w="1247"/>
+            <w:shd w:val="clear" w:fill="FFF2A8"/>
           </w:tcPr>
           <w:p>
             <w:pPr>
@@ -6323,6 +6468,7 @@
         <w:tc>
           <w:tcPr>
             <w:tcW w:type="dxa" w:w="794"/>
+            <w:shd w:val="clear" w:fill="FFF2A8"/>
           </w:tcPr>
           <w:p>
             <w:pPr>
@@ -6339,6 +6485,7 @@
         <w:tc>
           <w:tcPr>
             <w:tcW w:type="dxa" w:w="1020"/>
+            <w:shd w:val="clear" w:fill="FFF2A8"/>
           </w:tcPr>
           <w:p>
             <w:pPr>
@@ -6455,6 +6602,7 @@
         <w:tc>
           <w:tcPr>
             <w:tcW w:type="dxa" w:w="567"/>
+            <w:shd w:val="clear" w:fill="FFF2A8"/>
           </w:tcPr>
           <w:p>
             <w:pPr>
@@ -6471,6 +6619,7 @@
         <w:tc>
           <w:tcPr>
             <w:tcW w:type="dxa" w:w="4195"/>
+            <w:shd w:val="clear" w:fill="FFF2A8"/>
           </w:tcPr>
           <w:p>
             <w:pPr>
@@ -6487,6 +6636,7 @@
         <w:tc>
           <w:tcPr>
             <w:tcW w:type="dxa" w:w="1701"/>
+            <w:shd w:val="clear" w:fill="FFF2A8"/>
           </w:tcPr>
           <w:p>
             <w:pPr>
@@ -6503,6 +6653,7 @@
         <w:tc>
           <w:tcPr>
             <w:tcW w:type="dxa" w:w="1247"/>
+            <w:shd w:val="clear" w:fill="FFF2A8"/>
           </w:tcPr>
           <w:p>
             <w:pPr>
@@ -6519,6 +6670,7 @@
         <w:tc>
           <w:tcPr>
             <w:tcW w:type="dxa" w:w="794"/>
+            <w:shd w:val="clear" w:fill="FFF2A8"/>
           </w:tcPr>
           <w:p>
             <w:pPr>
@@ -6535,6 +6687,7 @@
         <w:tc>
           <w:tcPr>
             <w:tcW w:type="dxa" w:w="1020"/>
+            <w:shd w:val="clear" w:fill="FFF2A8"/>
           </w:tcPr>
           <w:p>
             <w:pPr>
@@ -6553,6 +6706,7 @@
         <w:tc>
           <w:tcPr>
             <w:tcW w:type="dxa" w:w="567"/>
+            <w:shd w:val="clear" w:fill="FFF2A8"/>
           </w:tcPr>
           <w:p>
             <w:pPr>
@@ -6569,6 +6723,7 @@
         <w:tc>
           <w:tcPr>
             <w:tcW w:type="dxa" w:w="4195"/>
+            <w:shd w:val="clear" w:fill="FFF2A8"/>
           </w:tcPr>
           <w:p>
             <w:pPr>
@@ -6585,6 +6740,7 @@
         <w:tc>
           <w:tcPr>
             <w:tcW w:type="dxa" w:w="1701"/>
+            <w:shd w:val="clear" w:fill="FFF2A8"/>
           </w:tcPr>
           <w:p>
             <w:pPr>
@@ -6601,6 +6757,7 @@
         <w:tc>
           <w:tcPr>
             <w:tcW w:type="dxa" w:w="1247"/>
+            <w:shd w:val="clear" w:fill="FFF2A8"/>
           </w:tcPr>
           <w:p>
             <w:pPr>
@@ -6617,6 +6774,7 @@
         <w:tc>
           <w:tcPr>
             <w:tcW w:type="dxa" w:w="794"/>
+            <w:shd w:val="clear" w:fill="FFF2A8"/>
           </w:tcPr>
           <w:p>
             <w:pPr>
@@ -6633,6 +6791,7 @@
         <w:tc>
           <w:tcPr>
             <w:tcW w:type="dxa" w:w="1020"/>
+            <w:shd w:val="clear" w:fill="FFF2A8"/>
           </w:tcPr>
           <w:p>
             <w:pPr>
@@ -7191,6 +7350,7 @@
         <w:tc>
           <w:tcPr>
             <w:tcW w:type="dxa" w:w="567"/>
+            <w:shd w:val="clear" w:fill="FFF2A8"/>
           </w:tcPr>
           <w:p>
             <w:pPr>
@@ -7207,6 +7367,7 @@
         <w:tc>
           <w:tcPr>
             <w:tcW w:type="dxa" w:w="4195"/>
+            <w:shd w:val="clear" w:fill="FFF2A8"/>
           </w:tcPr>
           <w:p>
             <w:pPr>
@@ -7223,6 +7384,7 @@
         <w:tc>
           <w:tcPr>
             <w:tcW w:type="dxa" w:w="1701"/>
+            <w:shd w:val="clear" w:fill="FFF2A8"/>
           </w:tcPr>
           <w:p>
             <w:pPr>
@@ -7239,6 +7401,7 @@
         <w:tc>
           <w:tcPr>
             <w:tcW w:type="dxa" w:w="1247"/>
+            <w:shd w:val="clear" w:fill="FFF2A8"/>
           </w:tcPr>
           <w:p>
             <w:pPr>
@@ -7255,6 +7418,7 @@
         <w:tc>
           <w:tcPr>
             <w:tcW w:type="dxa" w:w="794"/>
+            <w:shd w:val="clear" w:fill="FFF2A8"/>
           </w:tcPr>
           <w:p>
             <w:pPr>
@@ -7271,6 +7435,7 @@
         <w:tc>
           <w:tcPr>
             <w:tcW w:type="dxa" w:w="1020"/>
+            <w:shd w:val="clear" w:fill="FFF2A8"/>
           </w:tcPr>
           <w:p>
             <w:pPr>
@@ -7633,6 +7798,7 @@
         <w:tc>
           <w:tcPr>
             <w:tcW w:type="dxa" w:w="567"/>
+            <w:shd w:val="clear" w:fill="FFF2A8"/>
           </w:tcPr>
           <w:p>
             <w:pPr>
@@ -7649,6 +7815,7 @@
         <w:tc>
           <w:tcPr>
             <w:tcW w:type="dxa" w:w="4195"/>
+            <w:shd w:val="clear" w:fill="FFF2A8"/>
           </w:tcPr>
           <w:p>
             <w:pPr>
@@ -7665,6 +7832,7 @@
         <w:tc>
           <w:tcPr>
             <w:tcW w:type="dxa" w:w="1701"/>
+            <w:shd w:val="clear" w:fill="FFF2A8"/>
           </w:tcPr>
           <w:p>
             <w:pPr>
@@ -7681,6 +7849,7 @@
         <w:tc>
           <w:tcPr>
             <w:tcW w:type="dxa" w:w="1247"/>
+            <w:shd w:val="clear" w:fill="FFF2A8"/>
           </w:tcPr>
           <w:p>
             <w:pPr>
@@ -7697,6 +7866,7 @@
         <w:tc>
           <w:tcPr>
             <w:tcW w:type="dxa" w:w="794"/>
+            <w:shd w:val="clear" w:fill="FFF2A8"/>
           </w:tcPr>
           <w:p>
             <w:pPr>
@@ -7713,6 +7883,7 @@
         <w:tc>
           <w:tcPr>
             <w:tcW w:type="dxa" w:w="1020"/>
+            <w:shd w:val="clear" w:fill="FFF2A8"/>
           </w:tcPr>
           <w:p>
             <w:pPr>

</xml_diff>